<commit_message>
deepdive-top100: 2 full dives (STLTECH, MOIL) + 4 technicals refreshes (Maharashtra seamless, Shaily, Jayaswal Neco, KMC Speciality); STLTECH Medium, MOIL Low->Low-Medium
Co-Authored-By: Claude Sonnet 5 <noreply@anthropic.com>
</commit_message>
<xml_diff>
--- a/projects/valuepickr-open-screen/docs/MOIL Ltd.docx
+++ b/projects/valuepickr-open-screen/docs/MOIL Ltd.docx
@@ -32,7 +32,7 @@
           <w:sz w:val="22"/>
           <w:szCs w:val="22"/>
         </w:rPr>
-        <w:t xml:space="preserve">India's largest manganese producer with a sharp, real Q1FY27 profit inflection and a global supply squeeze tailwind, still small enough for a genuine multibagger case</w:t>
+        <w:t xml:space="preserve">India's sole large manganese producer (50% share, debt-free) with confirmed Q1 FY27 margin inflection; 2-3yr global supply-squeeze window could drive earnings multibagger, but cyclical risk and quarter-one inflection unconfirmed cap conviction at Low-Medium</w:t>
       </w:r>
     </w:p>
     <w:p>
@@ -232,6 +232,1685 @@
         <w:spacing w:after="120" w:before="280"/>
       </w:pPr>
       <w:r>
+        <w:t xml:space="preserve">Deep-Dive: Primary Documents (Annual Reports, Quarterly Results, Exchange Filings)</w:t>
+      </w:r>
+    </w:p>
+    <w:p>
+      <w:pPr>
+        <w:spacing w:after="120"/>
+      </w:pPr>
+      <w:r>
+        <w:rPr>
+          <w:i/>
+          <w:iCs/>
+          <w:color w:val="666666"/>
+          <w:sz w:val="18"/>
+          <w:szCs w:val="18"/>
+        </w:rPr>
+        <w:t xml:space="preserve">Pass 1 — 2026-10-05. Built from the company's own filings (3 years of annual reports, ~4 quarters of results/concalls, and 6 months of BSE/NSE announcements), read via the web — a deeper layer than the forum-sentiment read below.</w:t>
+      </w:r>
+    </w:p>
+    <w:p>
+      <w:pPr>
+        <w:spacing w:after="120"/>
+      </w:pPr>
+      <w:r>
+        <w:rPr>
+          <w:b/>
+          <w:bCs/>
+          <w:sz w:val="20"/>
+          <w:szCs w:val="20"/>
+        </w:rPr>
+        <w:t xml:space="preserve">Sources reviewed this pass:</w:t>
+      </w:r>
+    </w:p>
+    <w:p>
+      <w:pPr>
+        <w:pStyle w:val="ListParagraph"/>
+        <w:numPr>
+          <w:ilvl w:val="0"/>
+          <w:numId w:val="1"/>
+        </w:numPr>
+        <w:spacing w:after="60"/>
+      </w:pPr>
+      <w:r>
+        <w:t xml:space="preserve">FY24/25/26 annual reports (Trendlyne) — market share, debt-free structure, capex plans</w:t>
+      </w:r>
+    </w:p>
+    <w:p>
+      <w:pPr>
+        <w:pStyle w:val="ListParagraph"/>
+        <w:numPr>
+          <w:ilvl w:val="0"/>
+          <w:numId w:val="1"/>
+        </w:numPr>
+        <w:spacing w:after="60"/>
+      </w:pPr>
+      <w:r>
+        <w:t xml:space="preserve">Q1 FY27 results — production 5.08L MT (Q1 record), PAT +70% YoY, revenue +7%, prices up 17.5%</w:t>
+      </w:r>
+    </w:p>
+    <w:p>
+      <w:pPr>
+        <w:pStyle w:val="ListParagraph"/>
+        <w:numPr>
+          <w:ilvl w:val="0"/>
+          <w:numId w:val="1"/>
+        </w:numPr>
+        <w:spacing w:after="60"/>
+      </w:pPr>
+      <w:r>
+        <w:t xml:space="preserve">Recent market data — Argus Media (ferro-manganese weakness), PSU Connect (MOIL Oct 2026 price hike 5%), South32 impact on global supply</w:t>
+      </w:r>
+    </w:p>
+    <w:p>
+      <w:pPr>
+        <w:spacing w:after="120"/>
+      </w:pPr>
+      <w:r>
+        <w:rPr>
+          <w:b/>
+          <w:bCs/>
+          <w:sz w:val="20"/>
+          <w:szCs w:val="20"/>
+        </w:rPr>
+        <w:t xml:space="preserve">Annual-report findings (3-year view):</w:t>
+      </w:r>
+    </w:p>
+    <w:p>
+      <w:pPr>
+        <w:pStyle w:val="ListParagraph"/>
+        <w:numPr>
+          <w:ilvl w:val="0"/>
+          <w:numId w:val="1"/>
+        </w:numPr>
+        <w:spacing w:after="60"/>
+      </w:pPr>
+      <w:r>
+        <w:t xml:space="preserve">Debt-free PSU with 50% domestic manganese market share; 11 operational mines (stable asset base)</w:t>
+      </w:r>
+    </w:p>
+    <w:p>
+      <w:pPr>
+        <w:pStyle w:val="ListParagraph"/>
+        <w:numPr>
+          <w:ilvl w:val="0"/>
+          <w:numId w:val="1"/>
+        </w:numPr>
+        <w:spacing w:after="60"/>
+      </w:pPr>
+      <w:r>
+        <w:t xml:space="preserve">3-yr ROE 12.3% trailing; forecast 17.4% suggesting operational leverage from capex</w:t>
+      </w:r>
+    </w:p>
+    <w:p>
+      <w:pPr>
+        <w:pStyle w:val="ListParagraph"/>
+        <w:numPr>
+          <w:ilvl w:val="0"/>
+          <w:numId w:val="1"/>
+        </w:numPr>
+        <w:spacing w:after="60"/>
+      </w:pPr>
+      <w:r>
+        <w:t xml:space="preserve">5-yr revenue CAGR 4.67% (weak) masks Q1FY27 inflection: margin expansion from operational discipline + global pricing support</w:t>
+      </w:r>
+    </w:p>
+    <w:p>
+      <w:pPr>
+        <w:spacing w:after="120"/>
+      </w:pPr>
+      <w:r>
+        <w:rPr>
+          <w:b/>
+          <w:bCs/>
+          <w:sz w:val="20"/>
+          <w:szCs w:val="20"/>
+        </w:rPr>
+        <w:t xml:space="preserve">Quarterly trend (last ~4 quarters + concall commentary):</w:t>
+      </w:r>
+    </w:p>
+    <w:p>
+      <w:pPr>
+        <w:pStyle w:val="ListParagraph"/>
+        <w:numPr>
+          <w:ilvl w:val="0"/>
+          <w:numId w:val="1"/>
+        </w:numPr>
+        <w:spacing w:after="60"/>
+      </w:pPr>
+      <w:r>
+        <w:t xml:space="preserve">Q1 FY27 (Jun 26): PAT Rs 87.62 Cr (+70% YoY from ~Rs 51.6 Cr), revenue Rs 370.88 Cr (+7% QoQ, +7% YoY)</w:t>
+      </w:r>
+    </w:p>
+    <w:p>
+      <w:pPr>
+        <w:pStyle w:val="ListParagraph"/>
+        <w:numPr>
+          <w:ilvl w:val="0"/>
+          <w:numId w:val="1"/>
+        </w:numPr>
+        <w:spacing w:after="60"/>
+      </w:pPr>
+      <w:r>
+        <w:t xml:space="preserve">Production Q1 FY27: 5.08L MT (Q1 record, up from prior Q1s). Sell-through held.</w:t>
+      </w:r>
+    </w:p>
+    <w:p>
+      <w:pPr>
+        <w:pStyle w:val="ListParagraph"/>
+        <w:numPr>
+          <w:ilvl w:val="0"/>
+          <w:numId w:val="1"/>
+        </w:numPr>
+        <w:spacing w:after="60"/>
+      </w:pPr>
+      <w:r>
+        <w:t xml:space="preserve">Prior 4 quarters: Steady revenue Rs 320-360 Cr range, but earnings were lower (margin pressure pre-Q1).</w:t>
+      </w:r>
+    </w:p>
+    <w:p>
+      <w:pPr>
+        <w:spacing w:after="120"/>
+      </w:pPr>
+      <w:r>
+        <w:rPr>
+          <w:b/>
+          <w:bCs/>
+          <w:sz w:val="20"/>
+          <w:szCs w:val="20"/>
+        </w:rPr>
+        <w:t xml:space="preserve">Exchange announcements (last 6 months):</w:t>
+      </w:r>
+    </w:p>
+    <w:p>
+      <w:pPr>
+        <w:pStyle w:val="ListParagraph"/>
+        <w:numPr>
+          <w:ilvl w:val="0"/>
+          <w:numId w:val="1"/>
+        </w:numPr>
+        <w:spacing w:after="60"/>
+      </w:pPr>
+      <w:r>
+        <w:t xml:space="preserve">MOIL raised prices 17.5% for April 2026 (manganese ore grades), 5% again for October 2026 — indicates firm demand + pricing power through Q1-Q3 FY27</w:t>
+      </w:r>
+    </w:p>
+    <w:p>
+      <w:pPr>
+        <w:pStyle w:val="ListParagraph"/>
+        <w:numPr>
+          <w:ilvl w:val="0"/>
+          <w:numId w:val="1"/>
+        </w:numPr>
+        <w:spacing w:after="60"/>
+      </w:pPr>
+      <w:r>
+        <w:t xml:space="preserve">Recent market data (Argus, Sep-Oct 2026): ferro-manganese prices have weakened 2-3% (Rs 71k-&gt;69.5k range) — caution flag on margin sustainability</w:t>
+      </w:r>
+    </w:p>
+    <w:p>
+      <w:pPr>
+        <w:pStyle w:val="ListParagraph"/>
+        <w:numPr>
+          <w:ilvl w:val="0"/>
+          <w:numId w:val="1"/>
+        </w:numPr>
+        <w:spacing w:after="60"/>
+      </w:pPr>
+      <w:r>
+        <w:t xml:space="preserve">Production ramp: Q1 FY27 record 5.08L MT; Aug-Sep FY27 production ~1.8L MT/mo (run-rate ~6L MT for full FY27, vs ~5L MT FY26)</w:t>
+      </w:r>
+    </w:p>
+    <w:p>
+      <w:pPr>
+        <w:spacing w:after="120"/>
+      </w:pPr>
+      <w:r>
+        <w:rPr>
+          <w:b/>
+          <w:bCs/>
+          <w:sz w:val="20"/>
+          <w:szCs w:val="20"/>
+        </w:rPr>
+        <w:t xml:space="preserve">Key new facts vs. the prior write-up:</w:t>
+      </w:r>
+    </w:p>
+    <w:p>
+      <w:pPr>
+        <w:pStyle w:val="ListParagraph"/>
+        <w:numPr>
+          <w:ilvl w:val="0"/>
+          <w:numId w:val="1"/>
+        </w:numPr>
+        <w:spacing w:after="60"/>
+      </w:pPr>
+      <w:r>
+        <w:t xml:space="preserve">Q1 FY27 PAT inflection is real and confirmed: +70% on modest revenue growth (+7%) is genuine margin expansion, not revenue-driven profit</w:t>
+      </w:r>
+    </w:p>
+    <w:p>
+      <w:pPr>
+        <w:pStyle w:val="ListParagraph"/>
+        <w:numPr>
+          <w:ilvl w:val="0"/>
+          <w:numId w:val="1"/>
+        </w:numPr>
+        <w:spacing w:after="60"/>
+      </w:pPr>
+      <w:r>
+        <w:t xml:space="preserve">Global manganese supply squeeze is materially real: South32 Gemco mine disruption (since mid-FY25) has normalized supply; but no new major supply onstream yet</w:t>
+      </w:r>
+    </w:p>
+    <w:p>
+      <w:pPr>
+        <w:pStyle w:val="ListParagraph"/>
+        <w:numPr>
+          <w:ilvl w:val="0"/>
+          <w:numId w:val="1"/>
+        </w:numPr>
+        <w:spacing w:after="60"/>
+      </w:pPr>
+      <w:r>
+        <w:t xml:space="preserve">Domestic pricing power evident: MOIL able to raise prices 17.5% (Apr) + 5% (Oct) despite soft global steel backdrop — indicates strong local demand/market power</w:t>
+      </w:r>
+    </w:p>
+    <w:p>
+      <w:pPr>
+        <w:spacing w:after="120"/>
+      </w:pPr>
+      <w:r>
+        <w:rPr>
+          <w:b/>
+          <w:bCs/>
+          <w:sz w:val="20"/>
+          <w:szCs w:val="20"/>
+        </w:rPr>
+        <w:t xml:space="preserve">Open questions / what to watch:</w:t>
+      </w:r>
+    </w:p>
+    <w:p>
+      <w:pPr>
+        <w:pStyle w:val="ListParagraph"/>
+        <w:numPr>
+          <w:ilvl w:val="0"/>
+          <w:numId w:val="1"/>
+        </w:numPr>
+        <w:spacing w:after="60"/>
+      </w:pPr>
+      <w:r>
+        <w:t xml:space="preserve">Sustainability of Q1 margins: if ferro-manganese prices weaken further (Argus data shows Sep-Oct decline), will MOIL's Q2 FY27 margin hold at 23%+ or revert to 18-19%?</w:t>
+      </w:r>
+    </w:p>
+    <w:p>
+      <w:pPr>
+        <w:pStyle w:val="ListParagraph"/>
+        <w:numPr>
+          <w:ilvl w:val="0"/>
+          <w:numId w:val="1"/>
+        </w:numPr>
+        <w:spacing w:after="60"/>
+      </w:pPr>
+      <w:r>
+        <w:t xml:space="preserve">Cyclicality vs structural: is this a 1-2yr commodity up-cycle (steel capex cycle +3yr, but could reverse if India's construction cools), or is there structural EV/renewable demand lift?</w:t>
+      </w:r>
+    </w:p>
+    <w:p>
+      <w:pPr>
+        <w:pStyle w:val="ListParagraph"/>
+        <w:numPr>
+          <w:ilvl w:val="0"/>
+          <w:numId w:val="1"/>
+        </w:numPr>
+        <w:spacing w:after="60"/>
+      </w:pPr>
+      <w:r>
+        <w:t xml:space="preserve">Production ramp: Q1 record 5.08L MT; can 6L MT sustained full FY27, or will demand/price weakness force lower utilization?</w:t>
+      </w:r>
+    </w:p>
+    <w:p>
+      <w:pPr>
+        <w:spacing w:after="120" w:before="120"/>
+      </w:pPr>
+      <w:r>
+        <w:rPr>
+          <w:b/>
+          <w:bCs/>
+          <w:sz w:val="20"/>
+          <w:szCs w:val="20"/>
+        </w:rPr>
+        <w:t xml:space="preserve">Conviction impact: </w:t>
+      </w:r>
+      <w:r>
+        <w:rPr>
+          <w:sz w:val="20"/>
+          <w:szCs w:val="20"/>
+        </w:rPr>
+        <w:t xml:space="preserve">Low -&gt; Low-Medium. Q1 PAT inflection is real and the catalyst (supply squeeze + pricing power) is credible 2-3 mo further. However, recent ferro-manganese price weakness (Sep-Oct) is a caution flag — earnings sustainability unconfirmed. Small-cap size + debt-free structure + market-share moat support upside if inflection holds. Conviction upgraded from Low to Low-Medium on real margin proof, but not Medium until Q2 results confirm.</w:t>
+      </w:r>
+    </w:p>
+    <w:p>
+      <w:pPr>
+        <w:pStyle w:val="Heading1"/>
+        <w:spacing w:after="120" w:before="280"/>
+      </w:pPr>
+      <w:r>
+        <w:t xml:space="preserve">Guidance &amp; Expectation Gap</w:t>
+      </w:r>
+    </w:p>
+    <w:p>
+      <w:pPr>
+        <w:spacing w:after="120"/>
+      </w:pPr>
+      <w:r>
+        <w:rPr>
+          <w:i/>
+          <w:iCs/>
+          <w:color w:val="666666"/>
+          <w:sz w:val="18"/>
+          <w:szCs w:val="18"/>
+        </w:rPr>
+        <w:t xml:space="preserve">Management guidance decoded into commitments, graded on the expectation → action → operational → commercial → financial ladder, then compared to what the current price appears to assume. Method: playbook/guidance-and-expectation-gap.md.</w:t>
+      </w:r>
+    </w:p>
+    <w:p>
+      <w:pPr>
+        <w:spacing w:after="120"/>
+      </w:pPr>
+      <w:r>
+        <w:rPr>
+          <w:b/>
+          <w:bCs/>
+          <w:sz w:val="20"/>
+          <w:szCs w:val="20"/>
+        </w:rPr>
+        <w:t xml:space="preserve">Commitment ladder (most-proven first):</w:t>
+      </w:r>
+    </w:p>
+    <w:tbl>
+      <w:tblPr>
+        <w:tblW w:type="dxa" w:w="9000"/>
+        <w:tblBorders>
+          <w:top w:val="single" w:color="auto" w:sz="4"/>
+          <w:left w:val="single" w:color="auto" w:sz="4"/>
+          <w:bottom w:val="single" w:color="auto" w:sz="4"/>
+          <w:right w:val="single" w:color="auto" w:sz="4"/>
+          <w:insideH w:val="single" w:color="auto" w:sz="4"/>
+          <w:insideV w:val="single" w:color="auto" w:sz="4"/>
+        </w:tblBorders>
+      </w:tblPr>
+      <w:tblGrid>
+        <w:gridCol w:w="1100"/>
+        <w:gridCol w:w="2600"/>
+        <w:gridCol w:w="2400"/>
+        <w:gridCol w:w="900"/>
+        <w:gridCol w:w="1200"/>
+        <w:gridCol w:w="800"/>
+      </w:tblGrid>
+      <w:tr>
+        <w:trPr>
+          <w:tblHeader/>
+        </w:trPr>
+        <w:tc>
+          <w:tcPr>
+            <w:tcW w:type="dxa" w:w="1100"/>
+            <w:shd w:fill="F2F2F2" w:val="clear"/>
+          </w:tcPr>
+          <w:p>
+            <w:r>
+              <w:rPr>
+                <w:b/>
+                <w:bCs/>
+                <w:sz w:val="18"/>
+                <w:szCs w:val="18"/>
+              </w:rPr>
+              <w:t xml:space="preserve">Area</w:t>
+            </w:r>
+          </w:p>
+        </w:tc>
+        <w:tc>
+          <w:tcPr>
+            <w:tcW w:type="dxa" w:w="2600"/>
+            <w:shd w:fill="F2F2F2" w:val="clear"/>
+          </w:tcPr>
+          <w:p>
+            <w:r>
+              <w:rPr>
+                <w:b/>
+                <w:bCs/>
+                <w:sz w:val="18"/>
+                <w:szCs w:val="18"/>
+              </w:rPr>
+              <w:t xml:space="preserve">Commitment</w:t>
+            </w:r>
+          </w:p>
+        </w:tc>
+        <w:tc>
+          <w:tcPr>
+            <w:tcW w:type="dxa" w:w="2400"/>
+            <w:shd w:fill="F2F2F2" w:val="clear"/>
+          </w:tcPr>
+          <w:p>
+            <w:r>
+              <w:rPr>
+                <w:b/>
+                <w:bCs/>
+                <w:sz w:val="18"/>
+                <w:szCs w:val="18"/>
+              </w:rPr>
+              <w:t xml:space="preserve">Specifics</w:t>
+            </w:r>
+          </w:p>
+        </w:tc>
+        <w:tc>
+          <w:tcPr>
+            <w:tcW w:type="dxa" w:w="900"/>
+            <w:shd w:fill="F2F2F2" w:val="clear"/>
+          </w:tcPr>
+          <w:p>
+            <w:r>
+              <w:rPr>
+                <w:b/>
+                <w:bCs/>
+                <w:sz w:val="18"/>
+                <w:szCs w:val="18"/>
+              </w:rPr>
+              <w:t xml:space="preserve">By when</w:t>
+            </w:r>
+          </w:p>
+        </w:tc>
+        <w:tc>
+          <w:tcPr>
+            <w:tcW w:type="dxa" w:w="1200"/>
+            <w:shd w:fill="F2F2F2" w:val="clear"/>
+          </w:tcPr>
+          <w:p>
+            <w:r>
+              <w:rPr>
+                <w:b/>
+                <w:bCs/>
+                <w:sz w:val="18"/>
+                <w:szCs w:val="18"/>
+              </w:rPr>
+              <w:t xml:space="preserve">Stage</w:t>
+            </w:r>
+          </w:p>
+        </w:tc>
+        <w:tc>
+          <w:tcPr>
+            <w:tcW w:type="dxa" w:w="800"/>
+            <w:shd w:fill="F2F2F2" w:val="clear"/>
+          </w:tcPr>
+          <w:p>
+            <w:r>
+              <w:rPr>
+                <w:b/>
+                <w:bCs/>
+                <w:sz w:val="18"/>
+                <w:szCs w:val="18"/>
+              </w:rPr>
+              <w:t xml:space="preserve">Thesis-critical</w:t>
+            </w:r>
+          </w:p>
+        </w:tc>
+      </w:tr>
+      <w:tr>
+        <w:tc>
+          <w:tcPr>
+            <w:tcW w:type="dxa" w:w="1100"/>
+          </w:tcPr>
+          <w:p>
+            <w:r>
+              <w:rPr>
+                <w:b w:val="false"/>
+                <w:bCs w:val="false"/>
+                <w:sz w:val="18"/>
+                <w:szCs w:val="18"/>
+              </w:rPr>
+              <w:t xml:space="preserve">orders</w:t>
+            </w:r>
+          </w:p>
+        </w:tc>
+        <w:tc>
+          <w:tcPr>
+            <w:tcW w:type="dxa" w:w="2600"/>
+          </w:tcPr>
+          <w:p>
+            <w:r>
+              <w:rPr>
+                <w:b w:val="false"/>
+                <w:bCs w:val="false"/>
+                <w:sz w:val="18"/>
+                <w:szCs w:val="18"/>
+              </w:rPr>
+              <w:t xml:space="preserve">Strong domestic steel + EV-adjacent ferroalloy demand from CRGO/steel producers</w:t>
+            </w:r>
+          </w:p>
+        </w:tc>
+        <w:tc>
+          <w:tcPr>
+            <w:tcW w:type="dxa" w:w="2400"/>
+          </w:tcPr>
+          <w:p>
+            <w:r>
+              <w:rPr>
+                <w:b w:val="false"/>
+                <w:bCs w:val="false"/>
+                <w:sz w:val="18"/>
+                <w:szCs w:val="18"/>
+              </w:rPr>
+              <w:t xml:space="preserve">PSU steel mills (SAIL, JSW, Tata) capex ongoing; EV-specific demand (battery manganese)</w:t>
+            </w:r>
+          </w:p>
+        </w:tc>
+        <w:tc>
+          <w:tcPr>
+            <w:tcW w:type="dxa" w:w="900"/>
+          </w:tcPr>
+          <w:p>
+            <w:r>
+              <w:rPr>
+                <w:b w:val="false"/>
+                <w:bCs w:val="false"/>
+                <w:sz w:val="18"/>
+                <w:szCs w:val="18"/>
+              </w:rPr>
+              <w:t xml:space="preserve">FY27</w:t>
+            </w:r>
+          </w:p>
+        </w:tc>
+        <w:tc>
+          <w:tcPr>
+            <w:tcW w:type="dxa" w:w="1200"/>
+          </w:tcPr>
+          <w:p>
+            <w:r>
+              <w:rPr>
+                <w:b w:val="false"/>
+                <w:bCs w:val="false"/>
+                <w:sz w:val="18"/>
+                <w:szCs w:val="18"/>
+              </w:rPr>
+              <w:t xml:space="preserve">commercial</w:t>
+            </w:r>
+          </w:p>
+        </w:tc>
+        <w:tc>
+          <w:tcPr>
+            <w:tcW w:type="dxa" w:w="800"/>
+          </w:tcPr>
+          <w:p>
+            <w:r>
+              <w:rPr>
+                <w:b w:val="false"/>
+                <w:bCs w:val="false"/>
+                <w:sz w:val="18"/>
+                <w:szCs w:val="18"/>
+              </w:rPr>
+              <w:t xml:space="preserve">yes</w:t>
+            </w:r>
+          </w:p>
+        </w:tc>
+      </w:tr>
+    </w:tbl>
+    <w:p>
+      <w:pPr>
+        <w:spacing w:after="60" w:before="120"/>
+      </w:pPr>
+      <w:r>
+        <w:rPr>
+          <w:b/>
+          <w:bCs/>
+          <w:sz w:val="20"/>
+          <w:szCs w:val="20"/>
+        </w:rPr>
+        <w:t xml:space="preserve">Earnings chain: </w:t>
+      </w:r>
+      <w:r>
+        <w:rPr>
+          <w:b w:val="false"/>
+          <w:bCs w:val="false"/>
+          <w:sz w:val="20"/>
+          <w:szCs w:val="20"/>
+        </w:rPr>
+        <w:t xml:space="preserve">Global manganese supply squeeze (South32 Gemco disruption, no alternate sources ramping)</w:t>
+      </w:r>
+      <w:r>
+        <w:rPr>
+          <w:color w:val="666666"/>
+          <w:sz w:val="20"/>
+          <w:szCs w:val="20"/>
+        </w:rPr>
+        <w:t xml:space="preserve"> → </w:t>
+      </w:r>
+      <w:r>
+        <w:rPr>
+          <w:b w:val="false"/>
+          <w:bCs w:val="false"/>
+          <w:sz w:val="20"/>
+          <w:szCs w:val="20"/>
+        </w:rPr>
+        <w:t xml:space="preserve">Pricing power realized (MOIL raises prices 17.5% Apr, 5% Oct)</w:t>
+      </w:r>
+      <w:r>
+        <w:rPr>
+          <w:color w:val="666666"/>
+          <w:sz w:val="20"/>
+          <w:szCs w:val="20"/>
+        </w:rPr>
+        <w:t xml:space="preserve"> → </w:t>
+      </w:r>
+      <w:r>
+        <w:rPr>
+          <w:b w:val="false"/>
+          <w:bCs w:val="false"/>
+          <w:sz w:val="20"/>
+          <w:szCs w:val="20"/>
+        </w:rPr>
+        <w:t xml:space="preserve">Production ramp (Q1 record 5.08L MT, run-rate 6L MT FY27)</w:t>
+      </w:r>
+      <w:r>
+        <w:rPr>
+          <w:color w:val="666666"/>
+          <w:sz w:val="20"/>
+          <w:szCs w:val="20"/>
+        </w:rPr>
+        <w:t xml:space="preserve"> → </w:t>
+      </w:r>
+      <w:r>
+        <w:rPr>
+          <w:b w:val="false"/>
+          <w:bCs w:val="false"/>
+          <w:sz w:val="20"/>
+          <w:szCs w:val="20"/>
+        </w:rPr>
+        <w:t xml:space="preserve">Revenue growth + operating leverage</w:t>
+      </w:r>
+      <w:r>
+        <w:rPr>
+          <w:color w:val="666666"/>
+          <w:sz w:val="20"/>
+          <w:szCs w:val="20"/>
+        </w:rPr>
+        <w:t xml:space="preserve"> → </w:t>
+      </w:r>
+      <w:r>
+        <w:rPr>
+          <w:b w:val="false"/>
+          <w:bCs w:val="false"/>
+          <w:sz w:val="20"/>
+          <w:szCs w:val="20"/>
+        </w:rPr>
+        <w:t xml:space="preserve">EBITDA/PAT expansion</w:t>
+      </w:r>
+    </w:p>
+    <w:p>
+      <w:pPr>
+        <w:spacing w:after="120"/>
+      </w:pPr>
+      <w:r>
+        <w:rPr>
+          <w:color w:val="666666"/>
+          <w:sz w:val="18"/>
+          <w:szCs w:val="18"/>
+        </w:rPr>
+        <w:t xml:space="preserve">Bottleneck link: Ferro-manganese pricing — if prices weaken further post-Oct, margins collapse fast.</w:t>
+      </w:r>
+    </w:p>
+    <w:p>
+      <w:pPr>
+        <w:spacing w:after="120"/>
+      </w:pPr>
+      <w:r>
+        <w:rPr>
+          <w:color w:val="666666"/>
+          <w:sz w:val="18"/>
+          <w:szCs w:val="18"/>
+        </w:rPr>
+        <w:t xml:space="preserve">Operating leverage: yes — 5.08L MT Q1 (Q1 record) + 17.5% price hike + cost discipline → PAT +70% on 7% revenue</w:t>
+      </w:r>
+    </w:p>
+    <w:p>
+      <w:pPr>
+        <w:spacing w:after="120"/>
+      </w:pPr>
+      <w:r>
+        <w:rPr>
+          <w:color w:val="666666"/>
+          <w:sz w:val="18"/>
+          <w:szCs w:val="18"/>
+        </w:rPr>
+        <w:t xml:space="preserve">Evidenced: Q1 PAT +70% on 7% revenue is real operating leverage, not noise; Pricing power demonstrated (twice raised prices in 6mo); Production ramp confirmed (5.08L MT Q1 record). Still assumed: Prices sustain at Oct 2026 levels (recent weakness is temporary); Domestic steel capex remains firm through FY27; MOIL cost structure remains stable (mining inflation not a factor).</w:t>
+      </w:r>
+    </w:p>
+    <w:p>
+      <w:pPr>
+        <w:spacing w:after="120"/>
+      </w:pPr>
+      <w:r>
+        <w:rPr>
+          <w:b/>
+          <w:bCs/>
+          <w:sz w:val="20"/>
+          <w:szCs w:val="20"/>
+        </w:rPr>
+        <w:t xml:space="preserve">Market expectation vs. our path:</w:t>
+      </w:r>
+    </w:p>
+    <w:tbl>
+      <w:tblPr>
+        <w:tblW w:type="dxa" w:w="9000"/>
+        <w:tblBorders>
+          <w:top w:val="single" w:color="auto" w:sz="4"/>
+          <w:left w:val="single" w:color="auto" w:sz="4"/>
+          <w:bottom w:val="single" w:color="auto" w:sz="4"/>
+          <w:right w:val="single" w:color="auto" w:sz="4"/>
+          <w:insideH w:val="single" w:color="auto" w:sz="4"/>
+          <w:insideV w:val="single" w:color="auto" w:sz="4"/>
+        </w:tblBorders>
+      </w:tblPr>
+      <w:tblGrid>
+        <w:gridCol w:w="3200"/>
+        <w:gridCol w:w="5800"/>
+      </w:tblGrid>
+      <w:tr>
+        <w:tc>
+          <w:tcPr>
+            <w:tcW w:type="dxa" w:w="3200"/>
+            <w:shd w:fill="F2F2F2" w:val="clear"/>
+          </w:tcPr>
+          <w:p>
+            <w:r>
+              <w:rPr>
+                <w:b/>
+                <w:bCs/>
+              </w:rPr>
+              <w:t xml:space="preserve">As of</w:t>
+            </w:r>
+          </w:p>
+        </w:tc>
+        <w:tc>
+          <w:tcPr>
+            <w:tcW w:type="dxa" w:w="5800"/>
+          </w:tcPr>
+          <w:p>
+            <w:r>
+              <w:t xml:space="preserve">2026-10-05</w:t>
+            </w:r>
+          </w:p>
+        </w:tc>
+      </w:tr>
+      <w:tr>
+        <w:tc>
+          <w:tcPr>
+            <w:tcW w:type="dxa" w:w="3200"/>
+            <w:shd w:fill="F2F2F2" w:val="clear"/>
+          </w:tcPr>
+          <w:p>
+            <w:r>
+              <w:rPr>
+                <w:b/>
+                <w:bCs/>
+              </w:rPr>
+              <w:t xml:space="preserve">Price / multiple</w:t>
+            </w:r>
+          </w:p>
+        </w:tc>
+        <w:tc>
+          <w:tcPr>
+            <w:tcW w:type="dxa" w:w="5800"/>
+          </w:tcPr>
+          <w:p>
+            <w:r>
+              <w:t xml:space="preserve">—</w:t>
+            </w:r>
+          </w:p>
+        </w:tc>
+      </w:tr>
+      <w:tr>
+        <w:tc>
+          <w:tcPr>
+            <w:tcW w:type="dxa" w:w="3200"/>
+            <w:shd w:fill="F2F2F2" w:val="clear"/>
+          </w:tcPr>
+          <w:p>
+            <w:r>
+              <w:rPr>
+                <w:b/>
+                <w:bCs/>
+              </w:rPr>
+              <w:t xml:space="preserve">Right valuation lens</w:t>
+            </w:r>
+          </w:p>
+        </w:tc>
+        <w:tc>
+          <w:tcPr>
+            <w:tcW w:type="dxa" w:w="5800"/>
+          </w:tcPr>
+          <w:p>
+            <w:r>
+              <w:t xml:space="preserve">P/E</w:t>
+            </w:r>
+          </w:p>
+        </w:tc>
+      </w:tr>
+      <w:tr>
+        <w:tc>
+          <w:tcPr>
+            <w:tcW w:type="dxa" w:w="3200"/>
+            <w:shd w:fill="F2F2F2" w:val="clear"/>
+          </w:tcPr>
+          <w:p>
+            <w:r>
+              <w:rPr>
+                <w:b/>
+                <w:bCs/>
+              </w:rPr>
+              <w:t xml:space="preserve">Price implies</w:t>
+            </w:r>
+          </w:p>
+        </w:tc>
+        <w:tc>
+          <w:tcPr>
+            <w:tcW w:type="dxa" w:w="5800"/>
+          </w:tcPr>
+          <w:p>
+            <w:r>
+              <w:t xml:space="preserve">FY26-27 earnings +50% (based on PAT inflection) needs 20-25x multiple to justify current price; 3-yr 15-20% CAGR implied</w:t>
+            </w:r>
+          </w:p>
+        </w:tc>
+      </w:tr>
+      <w:tr>
+        <w:tc>
+          <w:tcPr>
+            <w:tcW w:type="dxa" w:w="3200"/>
+            <w:shd w:fill="F2F2F2" w:val="clear"/>
+          </w:tcPr>
+          <w:p>
+            <w:r>
+              <w:rPr>
+                <w:b/>
+                <w:bCs/>
+              </w:rPr>
+              <w:t xml:space="preserve">Our FY27</w:t>
+            </w:r>
+          </w:p>
+        </w:tc>
+        <w:tc>
+          <w:tcPr>
+            <w:tcW w:type="dxa" w:w="5800"/>
+          </w:tcPr>
+          <w:p>
+            <w:r>
+              <w:t xml:space="preserve">Revenue Rs 1,450-1,500 Cr (5.5L MT production at blended Rs 2,650/MT average); EBITDA margin 24% (robust but not unsustainable); PAT Rs 330-350 Cr (vs ~Rs 180 Cr FY26)</w:t>
+            </w:r>
+          </w:p>
+        </w:tc>
+      </w:tr>
+      <w:tr>
+        <w:tc>
+          <w:tcPr>
+            <w:tcW w:type="dxa" w:w="3200"/>
+            <w:shd w:fill="F2F2F2" w:val="clear"/>
+          </w:tcPr>
+          <w:p>
+            <w:r>
+              <w:rPr>
+                <w:b/>
+                <w:bCs/>
+              </w:rPr>
+              <w:t xml:space="preserve">Our FY28</w:t>
+            </w:r>
+          </w:p>
+        </w:tc>
+        <w:tc>
+          <w:tcPr>
+            <w:tcW w:type="dxa" w:w="5800"/>
+          </w:tcPr>
+          <w:p>
+            <w:r>
+              <w:t xml:space="preserve">Revenue Rs 1,550-1,650 Cr (if prices stabilize, production holds 5.5-6L MT); EBITDA margin 22-23% (normalized post-squeeze); PAT Rs 310-340 Cr (stable, not growth)</w:t>
+            </w:r>
+          </w:p>
+        </w:tc>
+      </w:tr>
+      <w:tr>
+        <w:tc>
+          <w:tcPr>
+            <w:tcW w:type="dxa" w:w="3200"/>
+            <w:shd w:fill="F2F2F2" w:val="clear"/>
+          </w:tcPr>
+          <w:p>
+            <w:r>
+              <w:rPr>
+                <w:b/>
+                <w:bCs/>
+              </w:rPr>
+              <w:t xml:space="preserve">Gap direction</w:t>
+            </w:r>
+          </w:p>
+        </w:tc>
+        <w:tc>
+          <w:tcPr>
+            <w:tcW w:type="dxa" w:w="5800"/>
+          </w:tcPr>
+          <w:p>
+            <w:r>
+              <w:t xml:space="preserve">partially-priced</w:t>
+            </w:r>
+          </w:p>
+        </w:tc>
+      </w:tr>
+      <w:tr>
+        <w:tc>
+          <w:tcPr>
+            <w:tcW w:type="dxa" w:w="3200"/>
+            <w:shd w:fill="F2F2F2" w:val="clear"/>
+          </w:tcPr>
+          <w:p>
+            <w:r>
+              <w:rPr>
+                <w:b/>
+                <w:bCs/>
+              </w:rPr>
+              <w:t xml:space="preserve">Gap type</w:t>
+            </w:r>
+          </w:p>
+        </w:tc>
+        <w:tc>
+          <w:tcPr>
+            <w:tcW w:type="dxa" w:w="5800"/>
+          </w:tcPr>
+          <w:p>
+            <w:r>
+              <w:t xml:space="preserve">duration</w:t>
+            </w:r>
+          </w:p>
+        </w:tc>
+      </w:tr>
+      <w:tr>
+        <w:tc>
+          <w:tcPr>
+            <w:tcW w:type="dxa" w:w="3200"/>
+            <w:shd w:fill="F2F2F2" w:val="clear"/>
+          </w:tcPr>
+          <w:p>
+            <w:r>
+              <w:rPr>
+                <w:b/>
+                <w:bCs/>
+              </w:rPr>
+              <w:t xml:space="preserve">Gap magnitude</w:t>
+            </w:r>
+          </w:p>
+        </w:tc>
+        <w:tc>
+          <w:tcPr>
+            <w:tcW w:type="dxa" w:w="5800"/>
+          </w:tcPr>
+          <w:p>
+            <w:r>
+              <w:t xml:space="preserve">10% (our FY28 PAT vs implied)</w:t>
+            </w:r>
+          </w:p>
+        </w:tc>
+      </w:tr>
+      <w:tr>
+        <w:tc>
+          <w:tcPr>
+            <w:tcW w:type="dxa" w:w="3200"/>
+            <w:shd w:fill="F2F2F2" w:val="clear"/>
+          </w:tcPr>
+          <w:p>
+            <w:r>
+              <w:rPr>
+                <w:b/>
+                <w:bCs/>
+              </w:rPr>
+              <w:t xml:space="preserve">Gap basis</w:t>
+            </w:r>
+          </w:p>
+        </w:tc>
+        <w:tc>
+          <w:tcPr>
+            <w:tcW w:type="dxa" w:w="5800"/>
+          </w:tcPr>
+          <w:p>
+            <w:r>
+              <w:t xml:space="preserve">Market likely pricing in a 1-2 yr earnings inflection tied to manganese squeeze; we see this as +50% FY27 earnings possible, but margin plateau/revert by FY28 if prices weaken. Upside if squeeze persists 3+ years or if EV/renewable demand lifts manganese demand structurally (unproven).</w:t>
+            </w:r>
+          </w:p>
+        </w:tc>
+      </w:tr>
+      <w:tr>
+        <w:tc>
+          <w:tcPr>
+            <w:tcW w:type="dxa" w:w="3200"/>
+            <w:shd w:fill="F2F2F2" w:val="clear"/>
+          </w:tcPr>
+          <w:p>
+            <w:r>
+              <w:rPr>
+                <w:b/>
+                <w:bCs/>
+              </w:rPr>
+              <w:t xml:space="preserve">Evidence quality</w:t>
+            </w:r>
+          </w:p>
+        </w:tc>
+        <w:tc>
+          <w:tcPr>
+            <w:tcW w:type="dxa" w:w="5800"/>
+          </w:tcPr>
+          <w:p>
+            <w:r>
+              <w:t xml:space="preserve">moderate</w:t>
+            </w:r>
+          </w:p>
+        </w:tc>
+      </w:tr>
+    </w:tbl>
+    <w:p>
+      <w:pPr>
+        <w:spacing w:after="120"/>
+      </w:pPr>
+      <w:r>
+        <w:rPr>
+          <w:i/>
+          <w:iCs/>
+          <w:color w:val="666666"/>
+          <w:sz w:val="16"/>
+          <w:szCs w:val="16"/>
+        </w:rPr>
+        <w:t xml:space="preserve">No analyst consensus; implied path based on FY27 run-rate, Q1 margin trends, recent Argus price data, and sector demand estimates</w:t>
+      </w:r>
+    </w:p>
+    <w:p>
+      <w:pPr>
+        <w:spacing w:after="120" w:before="120"/>
+      </w:pPr>
+      <w:r>
+        <w:rPr>
+          <w:b/>
+          <w:bCs/>
+          <w:sz w:val="20"/>
+          <w:szCs w:val="20"/>
+        </w:rPr>
+        <w:t xml:space="preserve">Catalyst: </w:t>
+      </w:r>
+      <w:r>
+        <w:rPr>
+          <w:sz w:val="20"/>
+          <w:szCs w:val="20"/>
+        </w:rPr>
+        <w:t xml:space="preserve">Q2 FY27 results (Oct-Nov 2026): confirm if PAT margin holds at 23%+ or reverts to 18-19%</w:t>
+      </w:r>
+      <w:r>
+        <w:rPr>
+          <w:color w:val="666666"/>
+          <w:sz w:val="18"/>
+          <w:szCs w:val="18"/>
+        </w:rPr>
+        <w:t xml:space="preserve"> (window ~2M from 2026-10-05; dated; evidence high; pending)</w:t>
+      </w:r>
+    </w:p>
+    <w:p>
+      <w:pPr>
+        <w:pStyle w:val="Heading1"/>
+        <w:spacing w:after="120" w:before="280"/>
+      </w:pPr>
+      <w:r>
+        <w:t xml:space="preserve">Ishmohit-Lens Checks (value chain · earnings quality · growth trajectory · management · quality metrics · track record · global-signal check)</w:t>
+      </w:r>
+    </w:p>
+    <w:p>
+      <w:pPr>
+        <w:spacing w:after="120"/>
+      </w:pPr>
+      <w:r>
+        <w:rPr>
+          <w:i/>
+          <w:iCs/>
+          <w:color w:val="666666"/>
+          <w:sz w:val="18"/>
+          <w:szCs w:val="18"/>
+        </w:rPr>
+        <w:t xml:space="preserve">Extra checks drawn from @ishmohit1 / SOIC methodology (playbook/ishmohit-soic-style.md): where the company sits in its value chain and what the supply side is doing, whether a margin/PAT inflection is structural or a cyclical peak, the rate-of-change of growth vs. what the multiple demands, and management quality as a positive attribute.</w:t>
+      </w:r>
+    </w:p>
+    <w:p>
+      <w:pPr>
+        <w:spacing w:after="60" w:before="120"/>
+      </w:pPr>
+      <w:r>
+        <w:rPr>
+          <w:b/>
+          <w:bCs/>
+          <w:sz w:val="20"/>
+          <w:szCs w:val="20"/>
+        </w:rPr>
+        <w:t xml:space="preserve">Earnings quality: </w:t>
+      </w:r>
+      <w:r>
+        <w:rPr>
+          <w:sz w:val="20"/>
+          <w:szCs w:val="20"/>
+        </w:rPr>
+        <w:t xml:space="preserve">margin driver cyclical</w:t>
+      </w:r>
+      <w:r>
+        <w:rPr>
+          <w:b/>
+          <w:bCs/>
+          <w:color w:val="A32020"/>
+          <w:sz w:val="20"/>
+          <w:szCs w:val="20"/>
+        </w:rPr>
+        <w:t xml:space="preserve">  — PEAK-MARGIN RISK: do not capitalise current margins</w:t>
+      </w:r>
+    </w:p>
+    <w:p>
+      <w:pPr>
+        <w:spacing w:after="120"/>
+      </w:pPr>
+      <w:r>
+        <w:rPr>
+          <w:color w:val="666666"/>
+          <w:sz w:val="18"/>
+          <w:szCs w:val="18"/>
+        </w:rPr>
+        <w:t xml:space="preserve">Drivers: Manganese ore pricing (global supply-driven, cyclical); Production volume (mine utilization, influenced by demand); Cost discipline (PSU efficiency gains, FY27 focus).</w:t>
+      </w:r>
+    </w:p>
+    <w:p>
+      <w:pPr>
+        <w:spacing w:after="120"/>
+      </w:pPr>
+      <w:r>
+        <w:rPr>
+          <w:color w:val="666666"/>
+          <w:sz w:val="18"/>
+          <w:szCs w:val="18"/>
+        </w:rPr>
+        <w:t xml:space="preserve">Current Q1 EBITDA margin ~24% is well above a through-cycle 15-17% expectation. Driven by global supply squeeze (temporary 2-3yr window) + local pricing power (sustainable at 15%+ markup). Through-cycle expectation: 16-18% EBITDA margin post-squeeze normalization. Peak-margin risk is MODERATE: if ferro prices weaken another 5-10%, margins compress 200-300bps.</w:t>
+      </w:r>
+    </w:p>
+    <w:p>
+      <w:pPr>
+        <w:spacing w:after="60" w:before="120"/>
+      </w:pPr>
+      <w:r>
+        <w:rPr>
+          <w:b/>
+          <w:bCs/>
+          <w:sz w:val="20"/>
+          <w:szCs w:val="20"/>
+        </w:rPr>
+        <w:t xml:space="preserve">Growth trajectory: </w:t>
+      </w:r>
+      <w:r>
+        <w:rPr>
+          <w:b w:val="false"/>
+          <w:bCs w:val="false"/>
+          <w:sz w:val="20"/>
+          <w:szCs w:val="20"/>
+        </w:rPr>
+        <w:t xml:space="preserve">YoY growth rate is accelerating</w:t>
+      </w:r>
+    </w:p>
+    <w:p>
+      <w:pPr>
+        <w:spacing w:after="120"/>
+      </w:pPr>
+      <w:r>
+        <w:rPr>
+          <w:color w:val="666666"/>
+          <w:sz w:val="18"/>
+          <w:szCs w:val="18"/>
+        </w:rPr>
+        <w:t xml:space="preserve">FY26 essentially flat; Q1 FY27 PAT +70% YoY is a sharp inflection off a weak base. Not a sustained multi-quarter trend yet.</w:t>
+      </w:r>
+    </w:p>
+    <w:p>
+      <w:pPr>
+        <w:spacing w:after="120"/>
+      </w:pPr>
+      <w:r>
+        <w:rPr>
+          <w:color w:val="666666"/>
+          <w:sz w:val="18"/>
+          <w:szCs w:val="18"/>
+        </w:rPr>
+        <w:t xml:space="preserve">Reverse P/E: 25x trailing P/E on ~Rs 88 Cr Q1 PAT annualized (Rs ~350 Cr FY27) needs growth to slow to 10-12% by FY28-29 to maintain; if PAT plateaus at Rs 330 Cr FY28, then 25x is expensive.</w:t>
+      </w:r>
+    </w:p>
+    <w:p>
+      <w:pPr>
+        <w:spacing w:after="120"/>
+      </w:pPr>
+      <w:r>
+        <w:rPr>
+          <w:b/>
+          <w:bCs/>
+          <w:sz w:val="20"/>
+          <w:szCs w:val="20"/>
+        </w:rPr>
+        <w:t xml:space="preserve">Management quality (TVGP's "P"):</w:t>
+      </w:r>
+    </w:p>
+    <w:tbl>
+      <w:tblPr>
+        <w:tblW w:type="dxa" w:w="9000"/>
+        <w:tblBorders>
+          <w:top w:val="single" w:color="auto" w:sz="4"/>
+          <w:left w:val="single" w:color="auto" w:sz="4"/>
+          <w:bottom w:val="single" w:color="auto" w:sz="4"/>
+          <w:right w:val="single" w:color="auto" w:sz="4"/>
+          <w:insideH w:val="single" w:color="auto" w:sz="4"/>
+          <w:insideV w:val="single" w:color="auto" w:sz="4"/>
+        </w:tblBorders>
+      </w:tblPr>
+      <w:tblGrid>
+        <w:gridCol w:w="3200"/>
+        <w:gridCol w:w="5800"/>
+      </w:tblGrid>
+      <w:tr>
+        <w:tc>
+          <w:tcPr>
+            <w:tcW w:type="dxa" w:w="3200"/>
+            <w:shd w:fill="F2F2F2" w:val="clear"/>
+          </w:tcPr>
+          <w:p>
+            <w:r>
+              <w:rPr>
+                <w:b/>
+                <w:bCs/>
+              </w:rPr>
+              <w:t xml:space="preserve">Assessment</w:t>
+            </w:r>
+          </w:p>
+        </w:tc>
+        <w:tc>
+          <w:tcPr>
+            <w:tcW w:type="dxa" w:w="5800"/>
+          </w:tcPr>
+          <w:p>
+            <w:r>
+              <w:t xml:space="preserve">neutral</w:t>
+            </w:r>
+          </w:p>
+        </w:tc>
+      </w:tr>
+      <w:tr>
+        <w:tc>
+          <w:tcPr>
+            <w:tcW w:type="dxa" w:w="3200"/>
+            <w:shd w:fill="F2F2F2" w:val="clear"/>
+          </w:tcPr>
+          <w:p>
+            <w:r>
+              <w:rPr>
+                <w:b/>
+                <w:bCs/>
+              </w:rPr>
+              <w:t xml:space="preserve">Capital allocation</w:t>
+            </w:r>
+          </w:p>
+        </w:tc>
+        <w:tc>
+          <w:tcPr>
+            <w:tcW w:type="dxa" w:w="5800"/>
+          </w:tcPr>
+          <w:p>
+            <w:r>
+              <w:t xml:space="preserve">PSU discipline: reinvested at 12-17% ROCE. No aggressive capex; cash returned as dividend (not reinvested for growth). Conservative capital-allocation stance. (neutral)</w:t>
+            </w:r>
+          </w:p>
+        </w:tc>
+      </w:tr>
+      <w:tr>
+        <w:tc>
+          <w:tcPr>
+            <w:tcW w:type="dxa" w:w="3200"/>
+            <w:shd w:fill="F2F2F2" w:val="clear"/>
+          </w:tcPr>
+          <w:p>
+            <w:r>
+              <w:rPr>
+                <w:b/>
+                <w:bCs/>
+              </w:rPr>
+              <w:t xml:space="preserve">Related-party trend</w:t>
+            </w:r>
+          </w:p>
+        </w:tc>
+        <w:tc>
+          <w:tcPr>
+            <w:tcW w:type="dxa" w:w="5800"/>
+          </w:tcPr>
+          <w:p>
+            <w:r>
+              <w:t xml:space="preserve">flat</w:t>
+            </w:r>
+          </w:p>
+        </w:tc>
+      </w:tr>
+      <w:tr>
+        <w:tc>
+          <w:tcPr>
+            <w:tcW w:type="dxa" w:w="3200"/>
+            <w:shd w:fill="F2F2F2" w:val="clear"/>
+          </w:tcPr>
+          <w:p>
+            <w:r>
+              <w:rPr>
+                <w:b/>
+                <w:bCs/>
+              </w:rPr>
+              <w:t xml:space="preserve">Guidance credibility</w:t>
+            </w:r>
+          </w:p>
+        </w:tc>
+        <w:tc>
+          <w:tcPr>
+            <w:tcW w:type="dxa" w:w="5800"/>
+          </w:tcPr>
+          <w:p>
+            <w:r>
+              <w:t xml:space="preserve">reliable</w:t>
+            </w:r>
+          </w:p>
+        </w:tc>
+      </w:tr>
+      <w:tr>
+        <w:tc>
+          <w:tcPr>
+            <w:tcW w:type="dxa" w:w="3200"/>
+            <w:shd w:fill="F2F2F2" w:val="clear"/>
+          </w:tcPr>
+          <w:p>
+            <w:r>
+              <w:rPr>
+                <w:b/>
+                <w:bCs/>
+              </w:rPr>
+              <w:t xml:space="preserve">Shareholder returns</w:t>
+            </w:r>
+          </w:p>
+        </w:tc>
+        <w:tc>
+          <w:tcPr>
+            <w:tcW w:type="dxa" w:w="5800"/>
+          </w:tcPr>
+          <w:p>
+            <w:r>
+              <w:t xml:space="preserve">consistent</w:t>
+            </w:r>
+          </w:p>
+        </w:tc>
+      </w:tr>
+      <w:tr>
+        <w:tc>
+          <w:tcPr>
+            <w:tcW w:type="dxa" w:w="3200"/>
+            <w:shd w:fill="F2F2F2" w:val="clear"/>
+          </w:tcPr>
+          <w:p>
+            <w:r>
+              <w:rPr>
+                <w:b/>
+                <w:bCs/>
+              </w:rPr>
+              <w:t xml:space="preserve">Capability ladder / VAP</w:t>
+            </w:r>
+          </w:p>
+        </w:tc>
+        <w:tc>
+          <w:tcPr>
+            <w:tcW w:type="dxa" w:w="5800"/>
+          </w:tcPr>
+          <w:p>
+            <w:r>
+              <w:t xml:space="preserve">No stated value-chain movement; operating margin leverage via cost discipline + pricing power is the only lever</w:t>
+            </w:r>
+          </w:p>
+        </w:tc>
+      </w:tr>
+    </w:tbl>
+    <w:p>
+      <w:pPr>
+        <w:spacing w:after="120"/>
+      </w:pPr>
+      <w:r>
+        <w:rPr>
+          <w:b/>
+          <w:bCs/>
+          <w:sz w:val="20"/>
+          <w:szCs w:val="20"/>
+        </w:rPr>
+        <w:t xml:space="preserve">Quality metrics (ROCE · debt · FCF · margin · capex):</w:t>
+      </w:r>
+    </w:p>
+    <w:tbl>
+      <w:tblPr>
+        <w:tblW w:type="dxa" w:w="9000"/>
+        <w:tblBorders>
+          <w:top w:val="single" w:color="auto" w:sz="4"/>
+          <w:left w:val="single" w:color="auto" w:sz="4"/>
+          <w:bottom w:val="single" w:color="auto" w:sz="4"/>
+          <w:right w:val="single" w:color="auto" w:sz="4"/>
+          <w:insideH w:val="single" w:color="auto" w:sz="4"/>
+          <w:insideV w:val="single" w:color="auto" w:sz="4"/>
+        </w:tblBorders>
+      </w:tblPr>
+      <w:tblGrid>
+        <w:gridCol w:w="3200"/>
+        <w:gridCol w:w="5800"/>
+      </w:tblGrid>
+      <w:tr>
+        <w:tc>
+          <w:tcPr>
+            <w:tcW w:type="dxa" w:w="3200"/>
+            <w:shd w:fill="F2F2F2" w:val="clear"/>
+          </w:tcPr>
+          <w:p>
+            <w:r>
+              <w:rPr>
+                <w:b/>
+                <w:bCs/>
+              </w:rPr>
+              <w:t xml:space="preserve">Assessment</w:t>
+            </w:r>
+          </w:p>
+        </w:tc>
+        <w:tc>
+          <w:tcPr>
+            <w:tcW w:type="dxa" w:w="5800"/>
+          </w:tcPr>
+          <w:p>
+            <w:r>
+              <w:t xml:space="preserve">positive</w:t>
+            </w:r>
+          </w:p>
+        </w:tc>
+      </w:tr>
+      <w:tr>
+        <w:tc>
+          <w:tcPr>
+            <w:tcW w:type="dxa" w:w="3200"/>
+            <w:shd w:fill="F2F2F2" w:val="clear"/>
+          </w:tcPr>
+          <w:p>
+            <w:r>
+              <w:rPr>
+                <w:b/>
+                <w:bCs/>
+              </w:rPr>
+              <w:t xml:space="preserve">ROCE</w:t>
+            </w:r>
+          </w:p>
+        </w:tc>
+        <w:tc>
+          <w:tcPr>
+            <w:tcW w:type="dxa" w:w="5800"/>
+          </w:tcPr>
+          <w:p>
+            <w:r>
+              <w:t xml:space="preserve">14% (improving)</w:t>
+            </w:r>
+          </w:p>
+        </w:tc>
+      </w:tr>
+      <w:tr>
+        <w:tc>
+          <w:tcPr>
+            <w:tcW w:type="dxa" w:w="3200"/>
+            <w:shd w:fill="F2F2F2" w:val="clear"/>
+          </w:tcPr>
+          <w:p>
+            <w:r>
+              <w:rPr>
+                <w:b/>
+                <w:bCs/>
+              </w:rPr>
+              <w:t xml:space="preserve">Leverage</w:t>
+            </w:r>
+          </w:p>
+        </w:tc>
+        <w:tc>
+          <w:tcPr>
+            <w:tcW w:type="dxa" w:w="5800"/>
+          </w:tcPr>
+          <w:p>
+            <w:r>
+              <w:t xml:space="preserve">Net debt/EBITDA -0.5x</w:t>
+            </w:r>
+          </w:p>
+        </w:tc>
+      </w:tr>
+      <w:tr>
+        <w:tc>
+          <w:tcPr>
+            <w:tcW w:type="dxa" w:w="3200"/>
+            <w:shd w:fill="F2F2F2" w:val="clear"/>
+          </w:tcPr>
+          <w:p>
+            <w:r>
+              <w:rPr>
+                <w:b/>
+                <w:bCs/>
+              </w:rPr>
+              <w:t xml:space="preserve">FCF conversion</w:t>
+            </w:r>
+          </w:p>
+        </w:tc>
+        <w:tc>
+          <w:tcPr>
+            <w:tcW w:type="dxa" w:w="5800"/>
+          </w:tcPr>
+          <w:p>
+            <w:r>
+              <w:t xml:space="preserve">85%</w:t>
+            </w:r>
+          </w:p>
+        </w:tc>
+      </w:tr>
+      <w:tr>
+        <w:tc>
+          <w:tcPr>
+            <w:tcW w:type="dxa" w:w="3200"/>
+            <w:shd w:fill="F2F2F2" w:val="clear"/>
+          </w:tcPr>
+          <w:p>
+            <w:r>
+              <w:rPr>
+                <w:b/>
+                <w:bCs/>
+              </w:rPr>
+              <w:t xml:space="preserve">Margin trend</w:t>
+            </w:r>
+          </w:p>
+        </w:tc>
+        <w:tc>
+          <w:tcPr>
+            <w:tcW w:type="dxa" w:w="5800"/>
+          </w:tcPr>
+          <w:p>
+            <w:r>
+              <w:t xml:space="preserve">expanding</w:t>
+            </w:r>
+          </w:p>
+        </w:tc>
+      </w:tr>
+      <w:tr>
+        <w:tc>
+          <w:tcPr>
+            <w:tcW w:type="dxa" w:w="3200"/>
+            <w:shd w:fill="F2F2F2" w:val="clear"/>
+          </w:tcPr>
+          <w:p>
+            <w:r>
+              <w:rPr>
+                <w:b/>
+                <w:bCs/>
+              </w:rPr>
+              <w:t xml:space="preserve">Capex efficiency</w:t>
+            </w:r>
+          </w:p>
+        </w:tc>
+        <w:tc>
+          <w:tcPr>
+            <w:tcW w:type="dxa" w:w="5800"/>
+          </w:tcPr>
+          <w:p>
+            <w:r>
+              <w:t xml:space="preserve">neutral</w:t>
+            </w:r>
+          </w:p>
+        </w:tc>
+      </w:tr>
+    </w:tbl>
+    <w:p>
+      <w:pPr>
+        <w:spacing w:after="60" w:before="120"/>
+      </w:pPr>
+      <w:r>
+        <w:rPr>
+          <w:b/>
+          <w:bCs/>
+          <w:sz w:val="20"/>
+          <w:szCs w:val="20"/>
+        </w:rPr>
+        <w:t xml:space="preserve">Track record (Coffee Can persistence check): </w:t>
+      </w:r>
+      <w:r>
+        <w:rPr>
+          <w:sz w:val="20"/>
+          <w:szCs w:val="20"/>
+        </w:rPr>
+        <w:t xml:space="preserve">cleared revenue growth ≥10% AND ROCE ≥15% in 0 of the last 3 years (consistency_score 0)</w:t>
+      </w:r>
+    </w:p>
+    <w:p>
+      <w:pPr>
+        <w:spacing w:after="120"/>
+      </w:pPr>
+      <w:r>
+        <w:rPr>
+          <w:color w:val="666666"/>
+          <w:sz w:val="18"/>
+          <w:szCs w:val="18"/>
+        </w:rPr>
+        <w:t xml:space="preserve">FY26: Revenue growth 4.67% (below 10%), ROCE 14% (below 15%). FY25: Revenue flat, ROCE weak. FY24: Revenue growth barely positive. No consistent Coffee-Can performance in last 3 years. However, Q1 FY27 inflection (if sustained) could mark entry into a 2-3yr high-ROCE window.</w:t>
+      </w:r>
+    </w:p>
+    <w:p>
+      <w:pPr>
+        <w:pStyle w:val="Heading1"/>
+        <w:spacing w:after="120" w:before="280"/>
+      </w:pPr>
+      <w:r>
         <w:t xml:space="preserve">Technical Read (Weekly / Monthly MACD + Bollinger Bands, or RSI/CCI/Williams %R proxy)</w:t>
       </w:r>
     </w:p>
@@ -449,6 +2128,34 @@
           <w:szCs w:val="24"/>
         </w:rPr>
         <w:t xml:space="preserve">10x-in-2-3-years</w:t>
+      </w:r>
+    </w:p>
+    <w:p>
+      <w:pPr>
+        <w:spacing w:after="120"/>
+      </w:pPr>
+      <w:r>
+        <w:rPr>
+          <w:color w:val="666666"/>
+          <w:sz w:val="20"/>
+          <w:szCs w:val="20"/>
+        </w:rPr>
+        <w:t xml:space="preserve">4-box gate — tailwind: yes · TAM: weak · moat: yes · valuation: weak  (score 3 / 4)</w:t>
+      </w:r>
+    </w:p>
+    <w:p>
+      <w:pPr>
+        <w:spacing w:after="120"/>
+      </w:pPr>
+      <w:r>
+        <w:rPr>
+          <w:i/>
+          <w:iCs/>
+          <w:color w:val="666666"/>
+          <w:sz w:val="20"/>
+          <w:szCs w:val="20"/>
+        </w:rPr>
+        <w:t xml:space="preserve">tailwind: 2-3yr global manganese supply squeeze (South32 Gemco disruption) is real + domestic steel/EV demand support = yes. moat: 50% domestic market share, 11 operational mines, PSU backing, sole large Indian producer = yes. tam: manganese TAM is modest even with EV uptake; no structural TAM expansion = weak. valuation: 25x on FY27E earnings, likely priced in partial cycle = weak. score 3.0 clears bar for 10x thesis; conviction held at Low-Medium due to 1-quarter inflection + cyclicality.</w:t>
       </w:r>
     </w:p>
     <w:p>

</xml_diff>